<commit_message>
docs: add uncertainty budget analysis
</commit_message>
<xml_diff>
--- a/Lu光频标绝对频率测量_内容汇报.docx
+++ b/Lu光频标绝对频率测量_内容汇报.docx
@@ -1313,7 +1313,2097 @@
         <w:pStyle w:val="Heading1"/>
       </w:pPr>
       <w:r>
-        <w:t>七、三个月结果与最终绝对频率</w:t>
+        <w:t>七、不确定度预算表及分析</w:t>
+      </w:r>
+    </w:p>
+    <w:p>
+      <w:r>
+        <w:t>来源说明：下表为原论文 Table 3 的汇报版。所有数值均为相对标准不确定度，单位为 10^-16；Cir. T 399-401 是三期月度估计，合并结果按论文的相关性模型计算。</w:t>
+      </w:r>
+    </w:p>
+    <w:tbl>
+      <w:tblPr>
+        <w:tblW w:type="auto" w:w="0"/>
+        <w:tblLayout w:type="fixed"/>
+        <w:tblLook w:firstColumn="1" w:firstRow="1" w:lastColumn="0" w:lastRow="0" w:noHBand="0" w:noVBand="1" w:val="04A0"/>
+      </w:tblPr>
+      <w:tblGrid>
+        <w:gridCol w:w="1976"/>
+        <w:gridCol w:w="1976"/>
+        <w:gridCol w:w="1976"/>
+        <w:gridCol w:w="1976"/>
+        <w:gridCol w:w="1976"/>
+      </w:tblGrid>
+      <w:tr>
+        <w:trPr>
+          <w:tblHeader w:val="true"/>
+        </w:trPr>
+        <w:tc>
+          <w:tcPr>
+            <w:tcW w:type="dxa" w:w="3672"/>
+            <w:shd w:fill="1F5D78"/>
+            <w:tcMar>
+              <w:top w:w="90" w:type="dxa"/>
+              <w:start w:w="80" w:type="dxa"/>
+              <w:bottom w:w="90" w:type="dxa"/>
+              <w:end w:w="80" w:type="dxa"/>
+            </w:tcMar>
+          </w:tcPr>
+          <w:p>
+            <w:pPr>
+              <w:spacing w:after="0"/>
+              <w:jc w:val="center"/>
+            </w:pPr>
+            <w:r>
+              <w:rPr>
+                <w:rFonts w:ascii="Microsoft YaHei" w:hAnsi="Microsoft YaHei" w:eastAsia="Microsoft YaHei"/>
+                <w:b/>
+                <w:color w:val="FFFFFF"/>
+                <w:sz w:val="16"/>
+              </w:rPr>
+              <w:t>不确定度来源</w:t>
+            </w:r>
+          </w:p>
+        </w:tc>
+        <w:tc>
+          <w:tcPr>
+            <w:tcW w:type="dxa" w:w="1512"/>
+            <w:shd w:fill="1F5D78"/>
+            <w:tcMar>
+              <w:top w:w="90" w:type="dxa"/>
+              <w:start w:w="80" w:type="dxa"/>
+              <w:bottom w:w="90" w:type="dxa"/>
+              <w:end w:w="80" w:type="dxa"/>
+            </w:tcMar>
+          </w:tcPr>
+          <w:p>
+            <w:pPr>
+              <w:spacing w:after="0"/>
+              <w:jc w:val="center"/>
+            </w:pPr>
+            <w:r>
+              <w:rPr>
+                <w:rFonts w:ascii="Microsoft YaHei" w:hAnsi="Microsoft YaHei" w:eastAsia="Microsoft YaHei"/>
+                <w:b/>
+                <w:color w:val="FFFFFF"/>
+                <w:sz w:val="16"/>
+              </w:rPr>
+              <w:t>Cir. T 399</w:t>
+            </w:r>
+          </w:p>
+        </w:tc>
+        <w:tc>
+          <w:tcPr>
+            <w:tcW w:type="dxa" w:w="1512"/>
+            <w:shd w:fill="1F5D78"/>
+            <w:tcMar>
+              <w:top w:w="90" w:type="dxa"/>
+              <w:start w:w="80" w:type="dxa"/>
+              <w:bottom w:w="90" w:type="dxa"/>
+              <w:end w:w="80" w:type="dxa"/>
+            </w:tcMar>
+          </w:tcPr>
+          <w:p>
+            <w:pPr>
+              <w:spacing w:after="0"/>
+              <w:jc w:val="center"/>
+            </w:pPr>
+            <w:r>
+              <w:rPr>
+                <w:rFonts w:ascii="Microsoft YaHei" w:hAnsi="Microsoft YaHei" w:eastAsia="Microsoft YaHei"/>
+                <w:b/>
+                <w:color w:val="FFFFFF"/>
+                <w:sz w:val="16"/>
+              </w:rPr>
+              <w:t>Cir. T 400</w:t>
+            </w:r>
+          </w:p>
+        </w:tc>
+        <w:tc>
+          <w:tcPr>
+            <w:tcW w:type="dxa" w:w="1512"/>
+            <w:shd w:fill="1F5D78"/>
+            <w:tcMar>
+              <w:top w:w="90" w:type="dxa"/>
+              <w:start w:w="80" w:type="dxa"/>
+              <w:bottom w:w="90" w:type="dxa"/>
+              <w:end w:w="80" w:type="dxa"/>
+            </w:tcMar>
+          </w:tcPr>
+          <w:p>
+            <w:pPr>
+              <w:spacing w:after="0"/>
+              <w:jc w:val="center"/>
+            </w:pPr>
+            <w:r>
+              <w:rPr>
+                <w:rFonts w:ascii="Microsoft YaHei" w:hAnsi="Microsoft YaHei" w:eastAsia="Microsoft YaHei"/>
+                <w:b/>
+                <w:color w:val="FFFFFF"/>
+                <w:sz w:val="16"/>
+              </w:rPr>
+              <w:t>Cir. T 401</w:t>
+            </w:r>
+          </w:p>
+        </w:tc>
+        <w:tc>
+          <w:tcPr>
+            <w:tcW w:type="dxa" w:w="1670"/>
+            <w:shd w:fill="1F5D78"/>
+            <w:tcMar>
+              <w:top w:w="90" w:type="dxa"/>
+              <w:start w:w="80" w:type="dxa"/>
+              <w:bottom w:w="90" w:type="dxa"/>
+              <w:end w:w="80" w:type="dxa"/>
+            </w:tcMar>
+          </w:tcPr>
+          <w:p>
+            <w:pPr>
+              <w:spacing w:after="0"/>
+              <w:jc w:val="center"/>
+            </w:pPr>
+            <w:r>
+              <w:rPr>
+                <w:rFonts w:ascii="Microsoft YaHei" w:hAnsi="Microsoft YaHei" w:eastAsia="Microsoft YaHei"/>
+                <w:b/>
+                <w:color w:val="FFFFFF"/>
+                <w:sz w:val="16"/>
+              </w:rPr>
+              <w:t>合并结果</w:t>
+            </w:r>
+          </w:p>
+        </w:tc>
+      </w:tr>
+      <w:tr>
+        <w:tc>
+          <w:tcPr>
+            <w:tcW w:type="dxa" w:w="3672"/>
+            <w:tcMar>
+              <w:top w:w="65" w:type="dxa"/>
+              <w:start w:w="80" w:type="dxa"/>
+              <w:bottom w:w="65" w:type="dxa"/>
+              <w:end w:w="80" w:type="dxa"/>
+            </w:tcMar>
+            <w:shd w:fill="EAF1F4"/>
+          </w:tcPr>
+          <w:p>
+            <w:pPr>
+              <w:spacing w:after="0"/>
+              <w:jc w:val="left"/>
+            </w:pPr>
+            <w:r>
+              <w:rPr>
+                <w:rFonts w:ascii="Microsoft YaHei" w:hAnsi="Microsoft YaHei" w:eastAsia="Microsoft YaHei"/>
+                <w:b/>
+                <w:color w:val="1F5D78"/>
+                <w:sz w:val="16"/>
+              </w:rPr>
+              <w:t>统计分量 u_A</w:t>
+            </w:r>
+          </w:p>
+        </w:tc>
+        <w:tc>
+          <w:tcPr>
+            <w:tcW w:type="dxa" w:w="1512"/>
+            <w:tcMar>
+              <w:top w:w="65" w:type="dxa"/>
+              <w:start w:w="80" w:type="dxa"/>
+              <w:bottom w:w="65" w:type="dxa"/>
+              <w:end w:w="80" w:type="dxa"/>
+            </w:tcMar>
+            <w:shd w:fill="EAF1F4"/>
+          </w:tcPr>
+          <w:p>
+            <w:pPr>
+              <w:spacing w:after="0"/>
+              <w:jc w:val="center"/>
+            </w:pPr>
+            <w:r>
+              <w:rPr>
+                <w:rFonts w:ascii="Microsoft YaHei" w:hAnsi="Microsoft YaHei" w:eastAsia="Microsoft YaHei"/>
+                <w:b/>
+                <w:color w:val="1F5D78"/>
+                <w:sz w:val="16"/>
+              </w:rPr>
+            </w:r>
+          </w:p>
+        </w:tc>
+        <w:tc>
+          <w:tcPr>
+            <w:tcW w:type="dxa" w:w="1512"/>
+            <w:tcMar>
+              <w:top w:w="65" w:type="dxa"/>
+              <w:start w:w="80" w:type="dxa"/>
+              <w:bottom w:w="65" w:type="dxa"/>
+              <w:end w:w="80" w:type="dxa"/>
+            </w:tcMar>
+            <w:shd w:fill="EAF1F4"/>
+          </w:tcPr>
+          <w:p>
+            <w:pPr>
+              <w:spacing w:after="0"/>
+              <w:jc w:val="center"/>
+            </w:pPr>
+            <w:r>
+              <w:rPr>
+                <w:rFonts w:ascii="Microsoft YaHei" w:hAnsi="Microsoft YaHei" w:eastAsia="Microsoft YaHei"/>
+                <w:b/>
+                <w:color w:val="1F5D78"/>
+                <w:sz w:val="16"/>
+              </w:rPr>
+            </w:r>
+          </w:p>
+        </w:tc>
+        <w:tc>
+          <w:tcPr>
+            <w:tcW w:type="dxa" w:w="1512"/>
+            <w:tcMar>
+              <w:top w:w="65" w:type="dxa"/>
+              <w:start w:w="80" w:type="dxa"/>
+              <w:bottom w:w="65" w:type="dxa"/>
+              <w:end w:w="80" w:type="dxa"/>
+            </w:tcMar>
+            <w:shd w:fill="EAF1F4"/>
+          </w:tcPr>
+          <w:p>
+            <w:pPr>
+              <w:spacing w:after="0"/>
+              <w:jc w:val="center"/>
+            </w:pPr>
+            <w:r>
+              <w:rPr>
+                <w:rFonts w:ascii="Microsoft YaHei" w:hAnsi="Microsoft YaHei" w:eastAsia="Microsoft YaHei"/>
+                <w:b/>
+                <w:color w:val="1F5D78"/>
+                <w:sz w:val="16"/>
+              </w:rPr>
+            </w:r>
+          </w:p>
+        </w:tc>
+        <w:tc>
+          <w:tcPr>
+            <w:tcW w:type="dxa" w:w="1670"/>
+            <w:tcMar>
+              <w:top w:w="65" w:type="dxa"/>
+              <w:start w:w="80" w:type="dxa"/>
+              <w:bottom w:w="65" w:type="dxa"/>
+              <w:end w:w="80" w:type="dxa"/>
+            </w:tcMar>
+            <w:shd w:fill="EAF1F4"/>
+          </w:tcPr>
+          <w:p>
+            <w:pPr>
+              <w:spacing w:after="0"/>
+              <w:jc w:val="center"/>
+            </w:pPr>
+            <w:r>
+              <w:rPr>
+                <w:rFonts w:ascii="Microsoft YaHei" w:hAnsi="Microsoft YaHei" w:eastAsia="Microsoft YaHei"/>
+                <w:b/>
+                <w:color w:val="1F5D78"/>
+                <w:sz w:val="16"/>
+              </w:rPr>
+            </w:r>
+          </w:p>
+        </w:tc>
+      </w:tr>
+      <w:tr>
+        <w:tc>
+          <w:tcPr>
+            <w:tcW w:type="dxa" w:w="3672"/>
+            <w:tcMar>
+              <w:top w:w="65" w:type="dxa"/>
+              <w:start w:w="80" w:type="dxa"/>
+              <w:bottom w:w="65" w:type="dxa"/>
+              <w:end w:w="80" w:type="dxa"/>
+            </w:tcMar>
+          </w:tcPr>
+          <w:p>
+            <w:pPr>
+              <w:spacing w:after="0"/>
+              <w:jc w:val="left"/>
+            </w:pPr>
+            <w:r>
+              <w:rPr>
+                <w:rFonts w:ascii="Microsoft YaHei" w:hAnsi="Microsoft YaHei" w:eastAsia="Microsoft YaHei"/>
+                <w:b w:val="0"/>
+                <w:color w:val="20313F"/>
+                <w:sz w:val="16"/>
+              </w:rPr>
+              <w:t>Lu/TAI</w:t>
+            </w:r>
+          </w:p>
+        </w:tc>
+        <w:tc>
+          <w:tcPr>
+            <w:tcW w:type="dxa" w:w="1512"/>
+            <w:tcMar>
+              <w:top w:w="65" w:type="dxa"/>
+              <w:start w:w="80" w:type="dxa"/>
+              <w:bottom w:w="65" w:type="dxa"/>
+              <w:end w:w="80" w:type="dxa"/>
+            </w:tcMar>
+          </w:tcPr>
+          <w:p>
+            <w:pPr>
+              <w:spacing w:after="0"/>
+              <w:jc w:val="center"/>
+            </w:pPr>
+            <w:r>
+              <w:rPr>
+                <w:rFonts w:ascii="Microsoft YaHei" w:hAnsi="Microsoft YaHei" w:eastAsia="Microsoft YaHei"/>
+                <w:b w:val="0"/>
+                <w:color w:val="20313F"/>
+                <w:sz w:val="16"/>
+              </w:rPr>
+              <w:t>9.9</w:t>
+            </w:r>
+          </w:p>
+        </w:tc>
+        <w:tc>
+          <w:tcPr>
+            <w:tcW w:type="dxa" w:w="1512"/>
+            <w:tcMar>
+              <w:top w:w="65" w:type="dxa"/>
+              <w:start w:w="80" w:type="dxa"/>
+              <w:bottom w:w="65" w:type="dxa"/>
+              <w:end w:w="80" w:type="dxa"/>
+            </w:tcMar>
+          </w:tcPr>
+          <w:p>
+            <w:pPr>
+              <w:spacing w:after="0"/>
+              <w:jc w:val="center"/>
+            </w:pPr>
+            <w:r>
+              <w:rPr>
+                <w:rFonts w:ascii="Microsoft YaHei" w:hAnsi="Microsoft YaHei" w:eastAsia="Microsoft YaHei"/>
+                <w:b w:val="0"/>
+                <w:color w:val="20313F"/>
+                <w:sz w:val="16"/>
+              </w:rPr>
+              <w:t>13</w:t>
+            </w:r>
+          </w:p>
+        </w:tc>
+        <w:tc>
+          <w:tcPr>
+            <w:tcW w:type="dxa" w:w="1512"/>
+            <w:tcMar>
+              <w:top w:w="65" w:type="dxa"/>
+              <w:start w:w="80" w:type="dxa"/>
+              <w:bottom w:w="65" w:type="dxa"/>
+              <w:end w:w="80" w:type="dxa"/>
+            </w:tcMar>
+          </w:tcPr>
+          <w:p>
+            <w:pPr>
+              <w:spacing w:after="0"/>
+              <w:jc w:val="center"/>
+            </w:pPr>
+            <w:r>
+              <w:rPr>
+                <w:rFonts w:ascii="Microsoft YaHei" w:hAnsi="Microsoft YaHei" w:eastAsia="Microsoft YaHei"/>
+                <w:b w:val="0"/>
+                <w:color w:val="20313F"/>
+                <w:sz w:val="16"/>
+              </w:rPr>
+              <w:t>19</w:t>
+            </w:r>
+          </w:p>
+        </w:tc>
+        <w:tc>
+          <w:tcPr>
+            <w:tcW w:type="dxa" w:w="1670"/>
+            <w:tcMar>
+              <w:top w:w="65" w:type="dxa"/>
+              <w:start w:w="80" w:type="dxa"/>
+              <w:bottom w:w="65" w:type="dxa"/>
+              <w:end w:w="80" w:type="dxa"/>
+            </w:tcMar>
+          </w:tcPr>
+          <w:p>
+            <w:pPr>
+              <w:spacing w:after="0"/>
+              <w:jc w:val="center"/>
+            </w:pPr>
+            <w:r>
+              <w:rPr>
+                <w:rFonts w:ascii="Microsoft YaHei" w:hAnsi="Microsoft YaHei" w:eastAsia="Microsoft YaHei"/>
+                <w:b w:val="0"/>
+                <w:color w:val="20313F"/>
+                <w:sz w:val="16"/>
+              </w:rPr>
+              <w:t>7.3</w:t>
+            </w:r>
+          </w:p>
+        </w:tc>
+      </w:tr>
+      <w:tr>
+        <w:tc>
+          <w:tcPr>
+            <w:tcW w:type="dxa" w:w="3672"/>
+            <w:tcMar>
+              <w:top w:w="65" w:type="dxa"/>
+              <w:start w:w="80" w:type="dxa"/>
+              <w:bottom w:w="65" w:type="dxa"/>
+              <w:end w:w="80" w:type="dxa"/>
+            </w:tcMar>
+          </w:tcPr>
+          <w:p>
+            <w:pPr>
+              <w:spacing w:after="0"/>
+              <w:jc w:val="left"/>
+            </w:pPr>
+            <w:r>
+              <w:rPr>
+                <w:rFonts w:ascii="Microsoft YaHei" w:hAnsi="Microsoft YaHei" w:eastAsia="Microsoft YaHei"/>
+                <w:b w:val="0"/>
+                <w:color w:val="20313F"/>
+                <w:sz w:val="16"/>
+              </w:rPr>
+              <w:t>TAI interpolation</w:t>
+            </w:r>
+          </w:p>
+        </w:tc>
+        <w:tc>
+          <w:tcPr>
+            <w:tcW w:type="dxa" w:w="1512"/>
+            <w:tcMar>
+              <w:top w:w="65" w:type="dxa"/>
+              <w:start w:w="80" w:type="dxa"/>
+              <w:bottom w:w="65" w:type="dxa"/>
+              <w:end w:w="80" w:type="dxa"/>
+            </w:tcMar>
+          </w:tcPr>
+          <w:p>
+            <w:pPr>
+              <w:spacing w:after="0"/>
+              <w:jc w:val="center"/>
+            </w:pPr>
+            <w:r>
+              <w:rPr>
+                <w:rFonts w:ascii="Microsoft YaHei" w:hAnsi="Microsoft YaHei" w:eastAsia="Microsoft YaHei"/>
+                <w:b w:val="0"/>
+                <w:color w:val="20313F"/>
+                <w:sz w:val="16"/>
+              </w:rPr>
+              <w:t>1.7</w:t>
+            </w:r>
+          </w:p>
+        </w:tc>
+        <w:tc>
+          <w:tcPr>
+            <w:tcW w:type="dxa" w:w="1512"/>
+            <w:tcMar>
+              <w:top w:w="65" w:type="dxa"/>
+              <w:start w:w="80" w:type="dxa"/>
+              <w:bottom w:w="65" w:type="dxa"/>
+              <w:end w:w="80" w:type="dxa"/>
+            </w:tcMar>
+          </w:tcPr>
+          <w:p>
+            <w:pPr>
+              <w:spacing w:after="0"/>
+              <w:jc w:val="center"/>
+            </w:pPr>
+            <w:r>
+              <w:rPr>
+                <w:rFonts w:ascii="Microsoft YaHei" w:hAnsi="Microsoft YaHei" w:eastAsia="Microsoft YaHei"/>
+                <w:b w:val="0"/>
+                <w:color w:val="20313F"/>
+                <w:sz w:val="16"/>
+              </w:rPr>
+              <w:t>2.9</w:t>
+            </w:r>
+          </w:p>
+        </w:tc>
+        <w:tc>
+          <w:tcPr>
+            <w:tcW w:type="dxa" w:w="1512"/>
+            <w:tcMar>
+              <w:top w:w="65" w:type="dxa"/>
+              <w:start w:w="80" w:type="dxa"/>
+              <w:bottom w:w="65" w:type="dxa"/>
+              <w:end w:w="80" w:type="dxa"/>
+            </w:tcMar>
+          </w:tcPr>
+          <w:p>
+            <w:pPr>
+              <w:spacing w:after="0"/>
+              <w:jc w:val="center"/>
+            </w:pPr>
+            <w:r>
+              <w:rPr>
+                <w:rFonts w:ascii="Microsoft YaHei" w:hAnsi="Microsoft YaHei" w:eastAsia="Microsoft YaHei"/>
+                <w:b w:val="0"/>
+                <w:color w:val="20313F"/>
+                <w:sz w:val="16"/>
+              </w:rPr>
+              <w:t>6.3</w:t>
+            </w:r>
+          </w:p>
+        </w:tc>
+        <w:tc>
+          <w:tcPr>
+            <w:tcW w:type="dxa" w:w="1670"/>
+            <w:tcMar>
+              <w:top w:w="65" w:type="dxa"/>
+              <w:start w:w="80" w:type="dxa"/>
+              <w:bottom w:w="65" w:type="dxa"/>
+              <w:end w:w="80" w:type="dxa"/>
+            </w:tcMar>
+          </w:tcPr>
+          <w:p>
+            <w:pPr>
+              <w:spacing w:after="0"/>
+              <w:jc w:val="center"/>
+            </w:pPr>
+            <w:r>
+              <w:rPr>
+                <w:rFonts w:ascii="Microsoft YaHei" w:hAnsi="Microsoft YaHei" w:eastAsia="Microsoft YaHei"/>
+                <w:b w:val="0"/>
+                <w:color w:val="20313F"/>
+                <w:sz w:val="16"/>
+              </w:rPr>
+              <w:t>1.5</w:t>
+            </w:r>
+          </w:p>
+        </w:tc>
+      </w:tr>
+      <w:tr>
+        <w:tc>
+          <w:tcPr>
+            <w:tcW w:type="dxa" w:w="3672"/>
+            <w:tcMar>
+              <w:top w:w="65" w:type="dxa"/>
+              <w:start w:w="80" w:type="dxa"/>
+              <w:bottom w:w="65" w:type="dxa"/>
+              <w:end w:w="80" w:type="dxa"/>
+            </w:tcMar>
+          </w:tcPr>
+          <w:p>
+            <w:pPr>
+              <w:spacing w:after="0"/>
+              <w:jc w:val="left"/>
+            </w:pPr>
+            <w:r>
+              <w:rPr>
+                <w:rFonts w:ascii="Microsoft YaHei" w:hAnsi="Microsoft YaHei" w:eastAsia="Microsoft YaHei"/>
+                <w:b w:val="0"/>
+                <w:color w:val="20313F"/>
+                <w:sz w:val="16"/>
+              </w:rPr>
+              <w:t>TAI/SI</w:t>
+            </w:r>
+          </w:p>
+        </w:tc>
+        <w:tc>
+          <w:tcPr>
+            <w:tcW w:type="dxa" w:w="1512"/>
+            <w:tcMar>
+              <w:top w:w="65" w:type="dxa"/>
+              <w:start w:w="80" w:type="dxa"/>
+              <w:bottom w:w="65" w:type="dxa"/>
+              <w:end w:w="80" w:type="dxa"/>
+            </w:tcMar>
+          </w:tcPr>
+          <w:p>
+            <w:pPr>
+              <w:spacing w:after="0"/>
+              <w:jc w:val="center"/>
+            </w:pPr>
+            <w:r>
+              <w:rPr>
+                <w:rFonts w:ascii="Microsoft YaHei" w:hAnsi="Microsoft YaHei" w:eastAsia="Microsoft YaHei"/>
+                <w:b w:val="0"/>
+                <w:color w:val="20313F"/>
+                <w:sz w:val="16"/>
+              </w:rPr>
+              <w:t>0.7</w:t>
+            </w:r>
+          </w:p>
+        </w:tc>
+        <w:tc>
+          <w:tcPr>
+            <w:tcW w:type="dxa" w:w="1512"/>
+            <w:tcMar>
+              <w:top w:w="65" w:type="dxa"/>
+              <w:start w:w="80" w:type="dxa"/>
+              <w:bottom w:w="65" w:type="dxa"/>
+              <w:end w:w="80" w:type="dxa"/>
+            </w:tcMar>
+          </w:tcPr>
+          <w:p>
+            <w:pPr>
+              <w:spacing w:after="0"/>
+              <w:jc w:val="center"/>
+            </w:pPr>
+            <w:r>
+              <w:rPr>
+                <w:rFonts w:ascii="Microsoft YaHei" w:hAnsi="Microsoft YaHei" w:eastAsia="Microsoft YaHei"/>
+                <w:b w:val="0"/>
+                <w:color w:val="20313F"/>
+                <w:sz w:val="16"/>
+              </w:rPr>
+              <w:t>0.7</w:t>
+            </w:r>
+          </w:p>
+        </w:tc>
+        <w:tc>
+          <w:tcPr>
+            <w:tcW w:type="dxa" w:w="1512"/>
+            <w:tcMar>
+              <w:top w:w="65" w:type="dxa"/>
+              <w:start w:w="80" w:type="dxa"/>
+              <w:bottom w:w="65" w:type="dxa"/>
+              <w:end w:w="80" w:type="dxa"/>
+            </w:tcMar>
+          </w:tcPr>
+          <w:p>
+            <w:pPr>
+              <w:spacing w:after="0"/>
+              <w:jc w:val="center"/>
+            </w:pPr>
+            <w:r>
+              <w:rPr>
+                <w:rFonts w:ascii="Microsoft YaHei" w:hAnsi="Microsoft YaHei" w:eastAsia="Microsoft YaHei"/>
+                <w:b w:val="0"/>
+                <w:color w:val="20313F"/>
+                <w:sz w:val="16"/>
+              </w:rPr>
+              <w:t>0.9</w:t>
+            </w:r>
+          </w:p>
+        </w:tc>
+        <w:tc>
+          <w:tcPr>
+            <w:tcW w:type="dxa" w:w="1670"/>
+            <w:tcMar>
+              <w:top w:w="65" w:type="dxa"/>
+              <w:start w:w="80" w:type="dxa"/>
+              <w:bottom w:w="65" w:type="dxa"/>
+              <w:end w:w="80" w:type="dxa"/>
+            </w:tcMar>
+          </w:tcPr>
+          <w:p>
+            <w:pPr>
+              <w:spacing w:after="0"/>
+              <w:jc w:val="center"/>
+            </w:pPr>
+            <w:r>
+              <w:rPr>
+                <w:rFonts w:ascii="Microsoft YaHei" w:hAnsi="Microsoft YaHei" w:eastAsia="Microsoft YaHei"/>
+                <w:b w:val="0"/>
+                <w:color w:val="20313F"/>
+                <w:sz w:val="16"/>
+              </w:rPr>
+              <w:t>0.4</w:t>
+            </w:r>
+          </w:p>
+        </w:tc>
+      </w:tr>
+      <w:tr>
+        <w:tc>
+          <w:tcPr>
+            <w:tcW w:type="dxa" w:w="3672"/>
+            <w:tcMar>
+              <w:top w:w="65" w:type="dxa"/>
+              <w:start w:w="80" w:type="dxa"/>
+              <w:bottom w:w="65" w:type="dxa"/>
+              <w:end w:w="80" w:type="dxa"/>
+            </w:tcMar>
+          </w:tcPr>
+          <w:p>
+            <w:pPr>
+              <w:spacing w:after="0"/>
+              <w:jc w:val="left"/>
+            </w:pPr>
+            <w:r>
+              <w:rPr>
+                <w:rFonts w:ascii="Microsoft YaHei" w:hAnsi="Microsoft YaHei" w:eastAsia="Microsoft YaHei"/>
+                <w:b/>
+                <w:color w:val="20313F"/>
+                <w:sz w:val="16"/>
+              </w:rPr>
+              <w:t>统计合计</w:t>
+            </w:r>
+          </w:p>
+        </w:tc>
+        <w:tc>
+          <w:tcPr>
+            <w:tcW w:type="dxa" w:w="1512"/>
+            <w:tcMar>
+              <w:top w:w="65" w:type="dxa"/>
+              <w:start w:w="80" w:type="dxa"/>
+              <w:bottom w:w="65" w:type="dxa"/>
+              <w:end w:w="80" w:type="dxa"/>
+            </w:tcMar>
+          </w:tcPr>
+          <w:p>
+            <w:pPr>
+              <w:spacing w:after="0"/>
+              <w:jc w:val="center"/>
+            </w:pPr>
+            <w:r>
+              <w:rPr>
+                <w:rFonts w:ascii="Microsoft YaHei" w:hAnsi="Microsoft YaHei" w:eastAsia="Microsoft YaHei"/>
+                <w:b/>
+                <w:color w:val="20313F"/>
+                <w:sz w:val="16"/>
+              </w:rPr>
+              <w:t>10</w:t>
+            </w:r>
+          </w:p>
+        </w:tc>
+        <w:tc>
+          <w:tcPr>
+            <w:tcW w:type="dxa" w:w="1512"/>
+            <w:tcMar>
+              <w:top w:w="65" w:type="dxa"/>
+              <w:start w:w="80" w:type="dxa"/>
+              <w:bottom w:w="65" w:type="dxa"/>
+              <w:end w:w="80" w:type="dxa"/>
+            </w:tcMar>
+          </w:tcPr>
+          <w:p>
+            <w:pPr>
+              <w:spacing w:after="0"/>
+              <w:jc w:val="center"/>
+            </w:pPr>
+            <w:r>
+              <w:rPr>
+                <w:rFonts w:ascii="Microsoft YaHei" w:hAnsi="Microsoft YaHei" w:eastAsia="Microsoft YaHei"/>
+                <w:b/>
+                <w:color w:val="20313F"/>
+                <w:sz w:val="16"/>
+              </w:rPr>
+              <w:t>13</w:t>
+            </w:r>
+          </w:p>
+        </w:tc>
+        <w:tc>
+          <w:tcPr>
+            <w:tcW w:type="dxa" w:w="1512"/>
+            <w:tcMar>
+              <w:top w:w="65" w:type="dxa"/>
+              <w:start w:w="80" w:type="dxa"/>
+              <w:bottom w:w="65" w:type="dxa"/>
+              <w:end w:w="80" w:type="dxa"/>
+            </w:tcMar>
+          </w:tcPr>
+          <w:p>
+            <w:pPr>
+              <w:spacing w:after="0"/>
+              <w:jc w:val="center"/>
+            </w:pPr>
+            <w:r>
+              <w:rPr>
+                <w:rFonts w:ascii="Microsoft YaHei" w:hAnsi="Microsoft YaHei" w:eastAsia="Microsoft YaHei"/>
+                <w:b/>
+                <w:color w:val="20313F"/>
+                <w:sz w:val="16"/>
+              </w:rPr>
+              <w:t>20</w:t>
+            </w:r>
+          </w:p>
+        </w:tc>
+        <w:tc>
+          <w:tcPr>
+            <w:tcW w:type="dxa" w:w="1670"/>
+            <w:tcMar>
+              <w:top w:w="65" w:type="dxa"/>
+              <w:start w:w="80" w:type="dxa"/>
+              <w:bottom w:w="65" w:type="dxa"/>
+              <w:end w:w="80" w:type="dxa"/>
+            </w:tcMar>
+          </w:tcPr>
+          <w:p>
+            <w:pPr>
+              <w:spacing w:after="0"/>
+              <w:jc w:val="center"/>
+            </w:pPr>
+            <w:r>
+              <w:rPr>
+                <w:rFonts w:ascii="Microsoft YaHei" w:hAnsi="Microsoft YaHei" w:eastAsia="Microsoft YaHei"/>
+                <w:b/>
+                <w:color w:val="20313F"/>
+                <w:sz w:val="16"/>
+              </w:rPr>
+              <w:t>7.4</w:t>
+            </w:r>
+          </w:p>
+        </w:tc>
+      </w:tr>
+      <w:tr>
+        <w:tc>
+          <w:tcPr>
+            <w:tcW w:type="dxa" w:w="3672"/>
+            <w:tcMar>
+              <w:top w:w="65" w:type="dxa"/>
+              <w:start w:w="80" w:type="dxa"/>
+              <w:bottom w:w="65" w:type="dxa"/>
+              <w:end w:w="80" w:type="dxa"/>
+            </w:tcMar>
+            <w:shd w:fill="EAF1F4"/>
+          </w:tcPr>
+          <w:p>
+            <w:pPr>
+              <w:spacing w:after="0"/>
+              <w:jc w:val="left"/>
+            </w:pPr>
+            <w:r>
+              <w:rPr>
+                <w:rFonts w:ascii="Microsoft YaHei" w:hAnsi="Microsoft YaHei" w:eastAsia="Microsoft YaHei"/>
+                <w:b/>
+                <w:color w:val="1F5D78"/>
+                <w:sz w:val="16"/>
+              </w:rPr>
+              <w:t>系统分量 u_B</w:t>
+            </w:r>
+          </w:p>
+        </w:tc>
+        <w:tc>
+          <w:tcPr>
+            <w:tcW w:type="dxa" w:w="1512"/>
+            <w:tcMar>
+              <w:top w:w="65" w:type="dxa"/>
+              <w:start w:w="80" w:type="dxa"/>
+              <w:bottom w:w="65" w:type="dxa"/>
+              <w:end w:w="80" w:type="dxa"/>
+            </w:tcMar>
+            <w:shd w:fill="EAF1F4"/>
+          </w:tcPr>
+          <w:p>
+            <w:pPr>
+              <w:spacing w:after="0"/>
+              <w:jc w:val="center"/>
+            </w:pPr>
+            <w:r>
+              <w:rPr>
+                <w:rFonts w:ascii="Microsoft YaHei" w:hAnsi="Microsoft YaHei" w:eastAsia="Microsoft YaHei"/>
+                <w:b/>
+                <w:color w:val="1F5D78"/>
+                <w:sz w:val="16"/>
+              </w:rPr>
+            </w:r>
+          </w:p>
+        </w:tc>
+        <w:tc>
+          <w:tcPr>
+            <w:tcW w:type="dxa" w:w="1512"/>
+            <w:tcMar>
+              <w:top w:w="65" w:type="dxa"/>
+              <w:start w:w="80" w:type="dxa"/>
+              <w:bottom w:w="65" w:type="dxa"/>
+              <w:end w:w="80" w:type="dxa"/>
+            </w:tcMar>
+            <w:shd w:fill="EAF1F4"/>
+          </w:tcPr>
+          <w:p>
+            <w:pPr>
+              <w:spacing w:after="0"/>
+              <w:jc w:val="center"/>
+            </w:pPr>
+            <w:r>
+              <w:rPr>
+                <w:rFonts w:ascii="Microsoft YaHei" w:hAnsi="Microsoft YaHei" w:eastAsia="Microsoft YaHei"/>
+                <w:b/>
+                <w:color w:val="1F5D78"/>
+                <w:sz w:val="16"/>
+              </w:rPr>
+            </w:r>
+          </w:p>
+        </w:tc>
+        <w:tc>
+          <w:tcPr>
+            <w:tcW w:type="dxa" w:w="1512"/>
+            <w:tcMar>
+              <w:top w:w="65" w:type="dxa"/>
+              <w:start w:w="80" w:type="dxa"/>
+              <w:bottom w:w="65" w:type="dxa"/>
+              <w:end w:w="80" w:type="dxa"/>
+            </w:tcMar>
+            <w:shd w:fill="EAF1F4"/>
+          </w:tcPr>
+          <w:p>
+            <w:pPr>
+              <w:spacing w:after="0"/>
+              <w:jc w:val="center"/>
+            </w:pPr>
+            <w:r>
+              <w:rPr>
+                <w:rFonts w:ascii="Microsoft YaHei" w:hAnsi="Microsoft YaHei" w:eastAsia="Microsoft YaHei"/>
+                <w:b/>
+                <w:color w:val="1F5D78"/>
+                <w:sz w:val="16"/>
+              </w:rPr>
+            </w:r>
+          </w:p>
+        </w:tc>
+        <w:tc>
+          <w:tcPr>
+            <w:tcW w:type="dxa" w:w="1670"/>
+            <w:tcMar>
+              <w:top w:w="65" w:type="dxa"/>
+              <w:start w:w="80" w:type="dxa"/>
+              <w:bottom w:w="65" w:type="dxa"/>
+              <w:end w:w="80" w:type="dxa"/>
+            </w:tcMar>
+            <w:shd w:fill="EAF1F4"/>
+          </w:tcPr>
+          <w:p>
+            <w:pPr>
+              <w:spacing w:after="0"/>
+              <w:jc w:val="center"/>
+            </w:pPr>
+            <w:r>
+              <w:rPr>
+                <w:rFonts w:ascii="Microsoft YaHei" w:hAnsi="Microsoft YaHei" w:eastAsia="Microsoft YaHei"/>
+                <w:b/>
+                <w:color w:val="1F5D78"/>
+                <w:sz w:val="16"/>
+              </w:rPr>
+            </w:r>
+          </w:p>
+        </w:tc>
+      </w:tr>
+      <w:tr>
+        <w:tc>
+          <w:tcPr>
+            <w:tcW w:type="dxa" w:w="3672"/>
+            <w:tcMar>
+              <w:top w:w="65" w:type="dxa"/>
+              <w:start w:w="80" w:type="dxa"/>
+              <w:bottom w:w="65" w:type="dxa"/>
+              <w:end w:w="80" w:type="dxa"/>
+            </w:tcMar>
+          </w:tcPr>
+          <w:p>
+            <w:pPr>
+              <w:spacing w:after="0"/>
+              <w:jc w:val="left"/>
+            </w:pPr>
+            <w:r>
+              <w:rPr>
+                <w:rFonts w:ascii="Microsoft YaHei" w:hAnsi="Microsoft YaHei" w:eastAsia="Microsoft YaHei"/>
+                <w:b w:val="0"/>
+                <w:color w:val="20313F"/>
+                <w:sz w:val="16"/>
+              </w:rPr>
+              <w:t>HM drift</w:t>
+            </w:r>
+          </w:p>
+        </w:tc>
+        <w:tc>
+          <w:tcPr>
+            <w:tcW w:type="dxa" w:w="1512"/>
+            <w:tcMar>
+              <w:top w:w="65" w:type="dxa"/>
+              <w:start w:w="80" w:type="dxa"/>
+              <w:bottom w:w="65" w:type="dxa"/>
+              <w:end w:w="80" w:type="dxa"/>
+            </w:tcMar>
+          </w:tcPr>
+          <w:p>
+            <w:pPr>
+              <w:spacing w:after="0"/>
+              <w:jc w:val="center"/>
+            </w:pPr>
+            <w:r>
+              <w:rPr>
+                <w:rFonts w:ascii="Microsoft YaHei" w:hAnsi="Microsoft YaHei" w:eastAsia="Microsoft YaHei"/>
+                <w:b w:val="0"/>
+                <w:color w:val="20313F"/>
+                <w:sz w:val="16"/>
+              </w:rPr>
+              <w:t>2.0</w:t>
+            </w:r>
+          </w:p>
+        </w:tc>
+        <w:tc>
+          <w:tcPr>
+            <w:tcW w:type="dxa" w:w="1512"/>
+            <w:tcMar>
+              <w:top w:w="65" w:type="dxa"/>
+              <w:start w:w="80" w:type="dxa"/>
+              <w:bottom w:w="65" w:type="dxa"/>
+              <w:end w:w="80" w:type="dxa"/>
+            </w:tcMar>
+          </w:tcPr>
+          <w:p>
+            <w:pPr>
+              <w:spacing w:after="0"/>
+              <w:jc w:val="center"/>
+            </w:pPr>
+            <w:r>
+              <w:rPr>
+                <w:rFonts w:ascii="Microsoft YaHei" w:hAnsi="Microsoft YaHei" w:eastAsia="Microsoft YaHei"/>
+                <w:b w:val="0"/>
+                <w:color w:val="20313F"/>
+                <w:sz w:val="16"/>
+              </w:rPr>
+              <w:t>2.0</w:t>
+            </w:r>
+          </w:p>
+        </w:tc>
+        <w:tc>
+          <w:tcPr>
+            <w:tcW w:type="dxa" w:w="1512"/>
+            <w:tcMar>
+              <w:top w:w="65" w:type="dxa"/>
+              <w:start w:w="80" w:type="dxa"/>
+              <w:bottom w:w="65" w:type="dxa"/>
+              <w:end w:w="80" w:type="dxa"/>
+            </w:tcMar>
+          </w:tcPr>
+          <w:p>
+            <w:pPr>
+              <w:spacing w:after="0"/>
+              <w:jc w:val="center"/>
+            </w:pPr>
+            <w:r>
+              <w:rPr>
+                <w:rFonts w:ascii="Microsoft YaHei" w:hAnsi="Microsoft YaHei" w:eastAsia="Microsoft YaHei"/>
+                <w:b w:val="0"/>
+                <w:color w:val="20313F"/>
+                <w:sz w:val="16"/>
+              </w:rPr>
+              <w:t>2.0</w:t>
+            </w:r>
+          </w:p>
+        </w:tc>
+        <w:tc>
+          <w:tcPr>
+            <w:tcW w:type="dxa" w:w="1670"/>
+            <w:tcMar>
+              <w:top w:w="65" w:type="dxa"/>
+              <w:start w:w="80" w:type="dxa"/>
+              <w:bottom w:w="65" w:type="dxa"/>
+              <w:end w:w="80" w:type="dxa"/>
+            </w:tcMar>
+          </w:tcPr>
+          <w:p>
+            <w:pPr>
+              <w:spacing w:after="0"/>
+              <w:jc w:val="center"/>
+            </w:pPr>
+            <w:r>
+              <w:rPr>
+                <w:rFonts w:ascii="Microsoft YaHei" w:hAnsi="Microsoft YaHei" w:eastAsia="Microsoft YaHei"/>
+                <w:b w:val="0"/>
+                <w:color w:val="20313F"/>
+                <w:sz w:val="16"/>
+              </w:rPr>
+              <w:t>2.0</w:t>
+            </w:r>
+          </w:p>
+        </w:tc>
+      </w:tr>
+      <w:tr>
+        <w:tc>
+          <w:tcPr>
+            <w:tcW w:type="dxa" w:w="3672"/>
+            <w:tcMar>
+              <w:top w:w="65" w:type="dxa"/>
+              <w:start w:w="80" w:type="dxa"/>
+              <w:bottom w:w="65" w:type="dxa"/>
+              <w:end w:w="80" w:type="dxa"/>
+            </w:tcMar>
+          </w:tcPr>
+          <w:p>
+            <w:pPr>
+              <w:spacing w:after="0"/>
+              <w:jc w:val="left"/>
+            </w:pPr>
+            <w:r>
+              <w:rPr>
+                <w:rFonts w:ascii="Microsoft YaHei" w:hAnsi="Microsoft YaHei" w:eastAsia="Microsoft YaHei"/>
+                <w:b w:val="0"/>
+                <w:color w:val="20313F"/>
+                <w:sz w:val="16"/>
+              </w:rPr>
+              <w:t>HM diurnal</w:t>
+            </w:r>
+          </w:p>
+        </w:tc>
+        <w:tc>
+          <w:tcPr>
+            <w:tcW w:type="dxa" w:w="1512"/>
+            <w:tcMar>
+              <w:top w:w="65" w:type="dxa"/>
+              <w:start w:w="80" w:type="dxa"/>
+              <w:bottom w:w="65" w:type="dxa"/>
+              <w:end w:w="80" w:type="dxa"/>
+            </w:tcMar>
+          </w:tcPr>
+          <w:p>
+            <w:pPr>
+              <w:spacing w:after="0"/>
+              <w:jc w:val="center"/>
+            </w:pPr>
+            <w:r>
+              <w:rPr>
+                <w:rFonts w:ascii="Microsoft YaHei" w:hAnsi="Microsoft YaHei" w:eastAsia="Microsoft YaHei"/>
+                <w:b w:val="0"/>
+                <w:color w:val="20313F"/>
+                <w:sz w:val="16"/>
+              </w:rPr>
+              <w:t>5.0</w:t>
+            </w:r>
+          </w:p>
+        </w:tc>
+        <w:tc>
+          <w:tcPr>
+            <w:tcW w:type="dxa" w:w="1512"/>
+            <w:tcMar>
+              <w:top w:w="65" w:type="dxa"/>
+              <w:start w:w="80" w:type="dxa"/>
+              <w:bottom w:w="65" w:type="dxa"/>
+              <w:end w:w="80" w:type="dxa"/>
+            </w:tcMar>
+          </w:tcPr>
+          <w:p>
+            <w:pPr>
+              <w:spacing w:after="0"/>
+              <w:jc w:val="center"/>
+            </w:pPr>
+            <w:r>
+              <w:rPr>
+                <w:rFonts w:ascii="Microsoft YaHei" w:hAnsi="Microsoft YaHei" w:eastAsia="Microsoft YaHei"/>
+                <w:b w:val="0"/>
+                <w:color w:val="20313F"/>
+                <w:sz w:val="16"/>
+              </w:rPr>
+              <w:t>5.0</w:t>
+            </w:r>
+          </w:p>
+        </w:tc>
+        <w:tc>
+          <w:tcPr>
+            <w:tcW w:type="dxa" w:w="1512"/>
+            <w:tcMar>
+              <w:top w:w="65" w:type="dxa"/>
+              <w:start w:w="80" w:type="dxa"/>
+              <w:bottom w:w="65" w:type="dxa"/>
+              <w:end w:w="80" w:type="dxa"/>
+            </w:tcMar>
+          </w:tcPr>
+          <w:p>
+            <w:pPr>
+              <w:spacing w:after="0"/>
+              <w:jc w:val="center"/>
+            </w:pPr>
+            <w:r>
+              <w:rPr>
+                <w:rFonts w:ascii="Microsoft YaHei" w:hAnsi="Microsoft YaHei" w:eastAsia="Microsoft YaHei"/>
+                <w:b w:val="0"/>
+                <w:color w:val="20313F"/>
+                <w:sz w:val="16"/>
+              </w:rPr>
+              <w:t>5.0</w:t>
+            </w:r>
+          </w:p>
+        </w:tc>
+        <w:tc>
+          <w:tcPr>
+            <w:tcW w:type="dxa" w:w="1670"/>
+            <w:tcMar>
+              <w:top w:w="65" w:type="dxa"/>
+              <w:start w:w="80" w:type="dxa"/>
+              <w:bottom w:w="65" w:type="dxa"/>
+              <w:end w:w="80" w:type="dxa"/>
+            </w:tcMar>
+          </w:tcPr>
+          <w:p>
+            <w:pPr>
+              <w:spacing w:after="0"/>
+              <w:jc w:val="center"/>
+            </w:pPr>
+            <w:r>
+              <w:rPr>
+                <w:rFonts w:ascii="Microsoft YaHei" w:hAnsi="Microsoft YaHei" w:eastAsia="Microsoft YaHei"/>
+                <w:b w:val="0"/>
+                <w:color w:val="20313F"/>
+                <w:sz w:val="16"/>
+              </w:rPr>
+              <w:t>5.0</w:t>
+            </w:r>
+          </w:p>
+        </w:tc>
+      </w:tr>
+      <w:tr>
+        <w:tc>
+          <w:tcPr>
+            <w:tcW w:type="dxa" w:w="3672"/>
+            <w:tcMar>
+              <w:top w:w="65" w:type="dxa"/>
+              <w:start w:w="80" w:type="dxa"/>
+              <w:bottom w:w="65" w:type="dxa"/>
+              <w:end w:w="80" w:type="dxa"/>
+            </w:tcMar>
+          </w:tcPr>
+          <w:p>
+            <w:pPr>
+              <w:spacing w:after="0"/>
+              <w:jc w:val="left"/>
+            </w:pPr>
+            <w:r>
+              <w:rPr>
+                <w:rFonts w:ascii="Microsoft YaHei" w:hAnsi="Microsoft YaHei" w:eastAsia="Microsoft YaHei"/>
+                <w:b w:val="0"/>
+                <w:color w:val="20313F"/>
+                <w:sz w:val="16"/>
+              </w:rPr>
+              <w:t>Lu systematics</w:t>
+            </w:r>
+          </w:p>
+        </w:tc>
+        <w:tc>
+          <w:tcPr>
+            <w:tcW w:type="dxa" w:w="1512"/>
+            <w:tcMar>
+              <w:top w:w="65" w:type="dxa"/>
+              <w:start w:w="80" w:type="dxa"/>
+              <w:bottom w:w="65" w:type="dxa"/>
+              <w:end w:w="80" w:type="dxa"/>
+            </w:tcMar>
+          </w:tcPr>
+          <w:p>
+            <w:pPr>
+              <w:spacing w:after="0"/>
+              <w:jc w:val="center"/>
+            </w:pPr>
+            <w:r>
+              <w:rPr>
+                <w:rFonts w:ascii="Microsoft YaHei" w:hAnsi="Microsoft YaHei" w:eastAsia="Microsoft YaHei"/>
+                <w:b w:val="0"/>
+                <w:color w:val="20313F"/>
+                <w:sz w:val="16"/>
+              </w:rPr>
+              <w:t>0.1</w:t>
+            </w:r>
+          </w:p>
+        </w:tc>
+        <w:tc>
+          <w:tcPr>
+            <w:tcW w:type="dxa" w:w="1512"/>
+            <w:tcMar>
+              <w:top w:w="65" w:type="dxa"/>
+              <w:start w:w="80" w:type="dxa"/>
+              <w:bottom w:w="65" w:type="dxa"/>
+              <w:end w:w="80" w:type="dxa"/>
+            </w:tcMar>
+          </w:tcPr>
+          <w:p>
+            <w:pPr>
+              <w:spacing w:after="0"/>
+              <w:jc w:val="center"/>
+            </w:pPr>
+            <w:r>
+              <w:rPr>
+                <w:rFonts w:ascii="Microsoft YaHei" w:hAnsi="Microsoft YaHei" w:eastAsia="Microsoft YaHei"/>
+                <w:b w:val="0"/>
+                <w:color w:val="20313F"/>
+                <w:sz w:val="16"/>
+              </w:rPr>
+              <w:t>0.1</w:t>
+            </w:r>
+          </w:p>
+        </w:tc>
+        <w:tc>
+          <w:tcPr>
+            <w:tcW w:type="dxa" w:w="1512"/>
+            <w:tcMar>
+              <w:top w:w="65" w:type="dxa"/>
+              <w:start w:w="80" w:type="dxa"/>
+              <w:bottom w:w="65" w:type="dxa"/>
+              <w:end w:w="80" w:type="dxa"/>
+            </w:tcMar>
+          </w:tcPr>
+          <w:p>
+            <w:pPr>
+              <w:spacing w:after="0"/>
+              <w:jc w:val="center"/>
+            </w:pPr>
+            <w:r>
+              <w:rPr>
+                <w:rFonts w:ascii="Microsoft YaHei" w:hAnsi="Microsoft YaHei" w:eastAsia="Microsoft YaHei"/>
+                <w:b w:val="0"/>
+                <w:color w:val="20313F"/>
+                <w:sz w:val="16"/>
+              </w:rPr>
+              <w:t>0.1</w:t>
+            </w:r>
+          </w:p>
+        </w:tc>
+        <w:tc>
+          <w:tcPr>
+            <w:tcW w:type="dxa" w:w="1670"/>
+            <w:tcMar>
+              <w:top w:w="65" w:type="dxa"/>
+              <w:start w:w="80" w:type="dxa"/>
+              <w:bottom w:w="65" w:type="dxa"/>
+              <w:end w:w="80" w:type="dxa"/>
+            </w:tcMar>
+          </w:tcPr>
+          <w:p>
+            <w:pPr>
+              <w:spacing w:after="0"/>
+              <w:jc w:val="center"/>
+            </w:pPr>
+            <w:r>
+              <w:rPr>
+                <w:rFonts w:ascii="Microsoft YaHei" w:hAnsi="Microsoft YaHei" w:eastAsia="Microsoft YaHei"/>
+                <w:b w:val="0"/>
+                <w:color w:val="20313F"/>
+                <w:sz w:val="16"/>
+              </w:rPr>
+              <w:t>0.1</w:t>
+            </w:r>
+          </w:p>
+        </w:tc>
+      </w:tr>
+      <w:tr>
+        <w:tc>
+          <w:tcPr>
+            <w:tcW w:type="dxa" w:w="3672"/>
+            <w:tcMar>
+              <w:top w:w="65" w:type="dxa"/>
+              <w:start w:w="80" w:type="dxa"/>
+              <w:bottom w:w="65" w:type="dxa"/>
+              <w:end w:w="80" w:type="dxa"/>
+            </w:tcMar>
+          </w:tcPr>
+          <w:p>
+            <w:pPr>
+              <w:spacing w:after="0"/>
+              <w:jc w:val="left"/>
+            </w:pPr>
+            <w:r>
+              <w:rPr>
+                <w:rFonts w:ascii="Microsoft YaHei" w:hAnsi="Microsoft YaHei" w:eastAsia="Microsoft YaHei"/>
+                <w:b w:val="0"/>
+                <w:color w:val="20313F"/>
+                <w:sz w:val="16"/>
+              </w:rPr>
+              <w:t>Gravitational shift</w:t>
+            </w:r>
+          </w:p>
+        </w:tc>
+        <w:tc>
+          <w:tcPr>
+            <w:tcW w:type="dxa" w:w="1512"/>
+            <w:tcMar>
+              <w:top w:w="65" w:type="dxa"/>
+              <w:start w:w="80" w:type="dxa"/>
+              <w:bottom w:w="65" w:type="dxa"/>
+              <w:end w:w="80" w:type="dxa"/>
+            </w:tcMar>
+          </w:tcPr>
+          <w:p>
+            <w:pPr>
+              <w:spacing w:after="0"/>
+              <w:jc w:val="center"/>
+            </w:pPr>
+            <w:r>
+              <w:rPr>
+                <w:rFonts w:ascii="Microsoft YaHei" w:hAnsi="Microsoft YaHei" w:eastAsia="Microsoft YaHei"/>
+                <w:b w:val="0"/>
+                <w:color w:val="20313F"/>
+                <w:sz w:val="16"/>
+              </w:rPr>
+              <w:t>0.4</w:t>
+            </w:r>
+          </w:p>
+        </w:tc>
+        <w:tc>
+          <w:tcPr>
+            <w:tcW w:type="dxa" w:w="1512"/>
+            <w:tcMar>
+              <w:top w:w="65" w:type="dxa"/>
+              <w:start w:w="80" w:type="dxa"/>
+              <w:bottom w:w="65" w:type="dxa"/>
+              <w:end w:w="80" w:type="dxa"/>
+            </w:tcMar>
+          </w:tcPr>
+          <w:p>
+            <w:pPr>
+              <w:spacing w:after="0"/>
+              <w:jc w:val="center"/>
+            </w:pPr>
+            <w:r>
+              <w:rPr>
+                <w:rFonts w:ascii="Microsoft YaHei" w:hAnsi="Microsoft YaHei" w:eastAsia="Microsoft YaHei"/>
+                <w:b w:val="0"/>
+                <w:color w:val="20313F"/>
+                <w:sz w:val="16"/>
+              </w:rPr>
+              <w:t>0.4</w:t>
+            </w:r>
+          </w:p>
+        </w:tc>
+        <w:tc>
+          <w:tcPr>
+            <w:tcW w:type="dxa" w:w="1512"/>
+            <w:tcMar>
+              <w:top w:w="65" w:type="dxa"/>
+              <w:start w:w="80" w:type="dxa"/>
+              <w:bottom w:w="65" w:type="dxa"/>
+              <w:end w:w="80" w:type="dxa"/>
+            </w:tcMar>
+          </w:tcPr>
+          <w:p>
+            <w:pPr>
+              <w:spacing w:after="0"/>
+              <w:jc w:val="center"/>
+            </w:pPr>
+            <w:r>
+              <w:rPr>
+                <w:rFonts w:ascii="Microsoft YaHei" w:hAnsi="Microsoft YaHei" w:eastAsia="Microsoft YaHei"/>
+                <w:b w:val="0"/>
+                <w:color w:val="20313F"/>
+                <w:sz w:val="16"/>
+              </w:rPr>
+              <w:t>0.4</w:t>
+            </w:r>
+          </w:p>
+        </w:tc>
+        <w:tc>
+          <w:tcPr>
+            <w:tcW w:type="dxa" w:w="1670"/>
+            <w:tcMar>
+              <w:top w:w="65" w:type="dxa"/>
+              <w:start w:w="80" w:type="dxa"/>
+              <w:bottom w:w="65" w:type="dxa"/>
+              <w:end w:w="80" w:type="dxa"/>
+            </w:tcMar>
+          </w:tcPr>
+          <w:p>
+            <w:pPr>
+              <w:spacing w:after="0"/>
+              <w:jc w:val="center"/>
+            </w:pPr>
+            <w:r>
+              <w:rPr>
+                <w:rFonts w:ascii="Microsoft YaHei" w:hAnsi="Microsoft YaHei" w:eastAsia="Microsoft YaHei"/>
+                <w:b w:val="0"/>
+                <w:color w:val="20313F"/>
+                <w:sz w:val="16"/>
+              </w:rPr>
+              <w:t>0.4</w:t>
+            </w:r>
+          </w:p>
+        </w:tc>
+      </w:tr>
+      <w:tr>
+        <w:tc>
+          <w:tcPr>
+            <w:tcW w:type="dxa" w:w="3672"/>
+            <w:tcMar>
+              <w:top w:w="65" w:type="dxa"/>
+              <w:start w:w="80" w:type="dxa"/>
+              <w:bottom w:w="65" w:type="dxa"/>
+              <w:end w:w="80" w:type="dxa"/>
+            </w:tcMar>
+          </w:tcPr>
+          <w:p>
+            <w:pPr>
+              <w:spacing w:after="0"/>
+              <w:jc w:val="left"/>
+            </w:pPr>
+            <w:r>
+              <w:rPr>
+                <w:rFonts w:ascii="Microsoft YaHei" w:hAnsi="Microsoft YaHei" w:eastAsia="Microsoft YaHei"/>
+                <w:b w:val="0"/>
+                <w:color w:val="20313F"/>
+                <w:sz w:val="16"/>
+              </w:rPr>
+              <w:t>PSFS</w:t>
+            </w:r>
+          </w:p>
+        </w:tc>
+        <w:tc>
+          <w:tcPr>
+            <w:tcW w:type="dxa" w:w="1512"/>
+            <w:tcMar>
+              <w:top w:w="65" w:type="dxa"/>
+              <w:start w:w="80" w:type="dxa"/>
+              <w:bottom w:w="65" w:type="dxa"/>
+              <w:end w:w="80" w:type="dxa"/>
+            </w:tcMar>
+          </w:tcPr>
+          <w:p>
+            <w:pPr>
+              <w:spacing w:after="0"/>
+              <w:jc w:val="center"/>
+            </w:pPr>
+            <w:r>
+              <w:rPr>
+                <w:rFonts w:ascii="Microsoft YaHei" w:hAnsi="Microsoft YaHei" w:eastAsia="Microsoft YaHei"/>
+                <w:b w:val="0"/>
+                <w:color w:val="20313F"/>
+                <w:sz w:val="16"/>
+              </w:rPr>
+              <w:t>0.9</w:t>
+            </w:r>
+          </w:p>
+        </w:tc>
+        <w:tc>
+          <w:tcPr>
+            <w:tcW w:type="dxa" w:w="1512"/>
+            <w:tcMar>
+              <w:top w:w="65" w:type="dxa"/>
+              <w:start w:w="80" w:type="dxa"/>
+              <w:bottom w:w="65" w:type="dxa"/>
+              <w:end w:w="80" w:type="dxa"/>
+            </w:tcMar>
+          </w:tcPr>
+          <w:p>
+            <w:pPr>
+              <w:spacing w:after="0"/>
+              <w:jc w:val="center"/>
+            </w:pPr>
+            <w:r>
+              <w:rPr>
+                <w:rFonts w:ascii="Microsoft YaHei" w:hAnsi="Microsoft YaHei" w:eastAsia="Microsoft YaHei"/>
+                <w:b w:val="0"/>
+                <w:color w:val="20313F"/>
+                <w:sz w:val="16"/>
+              </w:rPr>
+              <w:t>0.8</w:t>
+            </w:r>
+          </w:p>
+        </w:tc>
+        <w:tc>
+          <w:tcPr>
+            <w:tcW w:type="dxa" w:w="1512"/>
+            <w:tcMar>
+              <w:top w:w="65" w:type="dxa"/>
+              <w:start w:w="80" w:type="dxa"/>
+              <w:bottom w:w="65" w:type="dxa"/>
+              <w:end w:w="80" w:type="dxa"/>
+            </w:tcMar>
+          </w:tcPr>
+          <w:p>
+            <w:pPr>
+              <w:spacing w:after="0"/>
+              <w:jc w:val="center"/>
+            </w:pPr>
+            <w:r>
+              <w:rPr>
+                <w:rFonts w:ascii="Microsoft YaHei" w:hAnsi="Microsoft YaHei" w:eastAsia="Microsoft YaHei"/>
+                <w:b w:val="0"/>
+                <w:color w:val="20313F"/>
+                <w:sz w:val="16"/>
+              </w:rPr>
+              <w:t>0.9</w:t>
+            </w:r>
+          </w:p>
+        </w:tc>
+        <w:tc>
+          <w:tcPr>
+            <w:tcW w:type="dxa" w:w="1670"/>
+            <w:tcMar>
+              <w:top w:w="65" w:type="dxa"/>
+              <w:start w:w="80" w:type="dxa"/>
+              <w:bottom w:w="65" w:type="dxa"/>
+              <w:end w:w="80" w:type="dxa"/>
+            </w:tcMar>
+          </w:tcPr>
+          <w:p>
+            <w:pPr>
+              <w:spacing w:after="0"/>
+              <w:jc w:val="center"/>
+            </w:pPr>
+            <w:r>
+              <w:rPr>
+                <w:rFonts w:ascii="Microsoft YaHei" w:hAnsi="Microsoft YaHei" w:eastAsia="Microsoft YaHei"/>
+                <w:b w:val="0"/>
+                <w:color w:val="20313F"/>
+                <w:sz w:val="16"/>
+              </w:rPr>
+              <w:t>0.9</w:t>
+            </w:r>
+          </w:p>
+        </w:tc>
+      </w:tr>
+      <w:tr>
+        <w:tc>
+          <w:tcPr>
+            <w:tcW w:type="dxa" w:w="3672"/>
+            <w:tcMar>
+              <w:top w:w="65" w:type="dxa"/>
+              <w:start w:w="80" w:type="dxa"/>
+              <w:bottom w:w="65" w:type="dxa"/>
+              <w:end w:w="80" w:type="dxa"/>
+            </w:tcMar>
+          </w:tcPr>
+          <w:p>
+            <w:pPr>
+              <w:spacing w:after="0"/>
+              <w:jc w:val="left"/>
+            </w:pPr>
+            <w:r>
+              <w:rPr>
+                <w:rFonts w:ascii="Microsoft YaHei" w:hAnsi="Microsoft YaHei" w:eastAsia="Microsoft YaHei"/>
+                <w:b/>
+                <w:color w:val="20313F"/>
+                <w:sz w:val="16"/>
+              </w:rPr>
+              <w:t>系统合计</w:t>
+            </w:r>
+          </w:p>
+        </w:tc>
+        <w:tc>
+          <w:tcPr>
+            <w:tcW w:type="dxa" w:w="1512"/>
+            <w:tcMar>
+              <w:top w:w="65" w:type="dxa"/>
+              <w:start w:w="80" w:type="dxa"/>
+              <w:bottom w:w="65" w:type="dxa"/>
+              <w:end w:w="80" w:type="dxa"/>
+            </w:tcMar>
+          </w:tcPr>
+          <w:p>
+            <w:pPr>
+              <w:spacing w:after="0"/>
+              <w:jc w:val="center"/>
+            </w:pPr>
+            <w:r>
+              <w:rPr>
+                <w:rFonts w:ascii="Microsoft YaHei" w:hAnsi="Microsoft YaHei" w:eastAsia="Microsoft YaHei"/>
+                <w:b/>
+                <w:color w:val="20313F"/>
+                <w:sz w:val="16"/>
+              </w:rPr>
+              <w:t>5.5</w:t>
+            </w:r>
+          </w:p>
+        </w:tc>
+        <w:tc>
+          <w:tcPr>
+            <w:tcW w:type="dxa" w:w="1512"/>
+            <w:tcMar>
+              <w:top w:w="65" w:type="dxa"/>
+              <w:start w:w="80" w:type="dxa"/>
+              <w:bottom w:w="65" w:type="dxa"/>
+              <w:end w:w="80" w:type="dxa"/>
+            </w:tcMar>
+          </w:tcPr>
+          <w:p>
+            <w:pPr>
+              <w:spacing w:after="0"/>
+              <w:jc w:val="center"/>
+            </w:pPr>
+            <w:r>
+              <w:rPr>
+                <w:rFonts w:ascii="Microsoft YaHei" w:hAnsi="Microsoft YaHei" w:eastAsia="Microsoft YaHei"/>
+                <w:b/>
+                <w:color w:val="20313F"/>
+                <w:sz w:val="16"/>
+              </w:rPr>
+              <w:t>5.5</w:t>
+            </w:r>
+          </w:p>
+        </w:tc>
+        <w:tc>
+          <w:tcPr>
+            <w:tcW w:type="dxa" w:w="1512"/>
+            <w:tcMar>
+              <w:top w:w="65" w:type="dxa"/>
+              <w:start w:w="80" w:type="dxa"/>
+              <w:bottom w:w="65" w:type="dxa"/>
+              <w:end w:w="80" w:type="dxa"/>
+            </w:tcMar>
+          </w:tcPr>
+          <w:p>
+            <w:pPr>
+              <w:spacing w:after="0"/>
+              <w:jc w:val="center"/>
+            </w:pPr>
+            <w:r>
+              <w:rPr>
+                <w:rFonts w:ascii="Microsoft YaHei" w:hAnsi="Microsoft YaHei" w:eastAsia="Microsoft YaHei"/>
+                <w:b/>
+                <w:color w:val="20313F"/>
+                <w:sz w:val="16"/>
+              </w:rPr>
+              <w:t>5.5</w:t>
+            </w:r>
+          </w:p>
+        </w:tc>
+        <w:tc>
+          <w:tcPr>
+            <w:tcW w:type="dxa" w:w="1670"/>
+            <w:tcMar>
+              <w:top w:w="65" w:type="dxa"/>
+              <w:start w:w="80" w:type="dxa"/>
+              <w:bottom w:w="65" w:type="dxa"/>
+              <w:end w:w="80" w:type="dxa"/>
+            </w:tcMar>
+          </w:tcPr>
+          <w:p>
+            <w:pPr>
+              <w:spacing w:after="0"/>
+              <w:jc w:val="center"/>
+            </w:pPr>
+            <w:r>
+              <w:rPr>
+                <w:rFonts w:ascii="Microsoft YaHei" w:hAnsi="Microsoft YaHei" w:eastAsia="Microsoft YaHei"/>
+                <w:b/>
+                <w:color w:val="20313F"/>
+                <w:sz w:val="16"/>
+              </w:rPr>
+              <w:t>5.5</w:t>
+            </w:r>
+          </w:p>
+        </w:tc>
+      </w:tr>
+      <w:tr>
+        <w:tc>
+          <w:tcPr>
+            <w:tcW w:type="dxa" w:w="3672"/>
+            <w:tcMar>
+              <w:top w:w="65" w:type="dxa"/>
+              <w:start w:w="80" w:type="dxa"/>
+              <w:bottom w:w="65" w:type="dxa"/>
+              <w:end w:w="80" w:type="dxa"/>
+            </w:tcMar>
+            <w:shd w:fill="DCEBED"/>
+          </w:tcPr>
+          <w:p>
+            <w:pPr>
+              <w:spacing w:after="0"/>
+              <w:jc w:val="left"/>
+            </w:pPr>
+            <w:r>
+              <w:rPr>
+                <w:rFonts w:ascii="Microsoft YaHei" w:hAnsi="Microsoft YaHei" w:eastAsia="Microsoft YaHei"/>
+                <w:b/>
+                <w:color w:val="20313F"/>
+                <w:sz w:val="16"/>
+              </w:rPr>
+              <w:t>Lu/SI 总不确定度</w:t>
+            </w:r>
+          </w:p>
+        </w:tc>
+        <w:tc>
+          <w:tcPr>
+            <w:tcW w:type="dxa" w:w="1512"/>
+            <w:tcMar>
+              <w:top w:w="65" w:type="dxa"/>
+              <w:start w:w="80" w:type="dxa"/>
+              <w:bottom w:w="65" w:type="dxa"/>
+              <w:end w:w="80" w:type="dxa"/>
+            </w:tcMar>
+            <w:shd w:fill="DCEBED"/>
+          </w:tcPr>
+          <w:p>
+            <w:pPr>
+              <w:spacing w:after="0"/>
+              <w:jc w:val="center"/>
+            </w:pPr>
+            <w:r>
+              <w:rPr>
+                <w:rFonts w:ascii="Microsoft YaHei" w:hAnsi="Microsoft YaHei" w:eastAsia="Microsoft YaHei"/>
+                <w:b/>
+                <w:color w:val="20313F"/>
+                <w:sz w:val="16"/>
+              </w:rPr>
+              <w:t>11</w:t>
+            </w:r>
+          </w:p>
+        </w:tc>
+        <w:tc>
+          <w:tcPr>
+            <w:tcW w:type="dxa" w:w="1512"/>
+            <w:tcMar>
+              <w:top w:w="65" w:type="dxa"/>
+              <w:start w:w="80" w:type="dxa"/>
+              <w:bottom w:w="65" w:type="dxa"/>
+              <w:end w:w="80" w:type="dxa"/>
+            </w:tcMar>
+            <w:shd w:fill="DCEBED"/>
+          </w:tcPr>
+          <w:p>
+            <w:pPr>
+              <w:spacing w:after="0"/>
+              <w:jc w:val="center"/>
+            </w:pPr>
+            <w:r>
+              <w:rPr>
+                <w:rFonts w:ascii="Microsoft YaHei" w:hAnsi="Microsoft YaHei" w:eastAsia="Microsoft YaHei"/>
+                <w:b/>
+                <w:color w:val="20313F"/>
+                <w:sz w:val="16"/>
+              </w:rPr>
+              <w:t>14</w:t>
+            </w:r>
+          </w:p>
+        </w:tc>
+        <w:tc>
+          <w:tcPr>
+            <w:tcW w:type="dxa" w:w="1512"/>
+            <w:tcMar>
+              <w:top w:w="65" w:type="dxa"/>
+              <w:start w:w="80" w:type="dxa"/>
+              <w:bottom w:w="65" w:type="dxa"/>
+              <w:end w:w="80" w:type="dxa"/>
+            </w:tcMar>
+            <w:shd w:fill="DCEBED"/>
+          </w:tcPr>
+          <w:p>
+            <w:pPr>
+              <w:spacing w:after="0"/>
+              <w:jc w:val="center"/>
+            </w:pPr>
+            <w:r>
+              <w:rPr>
+                <w:rFonts w:ascii="Microsoft YaHei" w:hAnsi="Microsoft YaHei" w:eastAsia="Microsoft YaHei"/>
+                <w:b/>
+                <w:color w:val="20313F"/>
+                <w:sz w:val="16"/>
+              </w:rPr>
+              <w:t>20</w:t>
+            </w:r>
+          </w:p>
+        </w:tc>
+        <w:tc>
+          <w:tcPr>
+            <w:tcW w:type="dxa" w:w="1670"/>
+            <w:tcMar>
+              <w:top w:w="65" w:type="dxa"/>
+              <w:start w:w="80" w:type="dxa"/>
+              <w:bottom w:w="65" w:type="dxa"/>
+              <w:end w:w="80" w:type="dxa"/>
+            </w:tcMar>
+            <w:shd w:fill="DCEBED"/>
+          </w:tcPr>
+          <w:p>
+            <w:pPr>
+              <w:spacing w:after="0"/>
+              <w:jc w:val="center"/>
+            </w:pPr>
+            <w:r>
+              <w:rPr>
+                <w:rFonts w:ascii="Microsoft YaHei" w:hAnsi="Microsoft YaHei" w:eastAsia="Microsoft YaHei"/>
+                <w:b/>
+                <w:color w:val="20313F"/>
+                <w:sz w:val="16"/>
+              </w:rPr>
+              <w:t>9.2</w:t>
+            </w:r>
+          </w:p>
+        </w:tc>
+      </w:tr>
+    </w:tbl>
+    <w:p>
+      <w:pPr>
+        <w:pStyle w:val="Heading2"/>
+      </w:pPr>
+      <w:r>
+        <w:t>7.1 合成方法</w:t>
+      </w:r>
+    </w:p>
+    <w:p>
+      <w:r>
+        <w:t>【基础补充】相互独立的标准不确定度分量采用方差相加，即平方和开根号。若分量相关，则还必须加入协方差项，不能直接使用下面的简式。</w:t>
+      </w:r>
+    </w:p>
+    <w:p>
+      <w:pPr>
+        <w:spacing w:before="60" w:after="100"/>
+        <w:jc w:val="center"/>
+      </w:pPr>
+      <w:r>
+        <w:rPr>
+          <w:rFonts w:ascii="Cambria Math" w:hAnsi="Cambria Math" w:eastAsia="Cambria Math"/>
+          <w:i/>
+          <w:color w:val="20313F"/>
+          <w:sz w:val="21"/>
+        </w:rPr>
+        <w:t>u_c = sqrt(sum(u_i^2))</w:t>
+      </w:r>
+    </w:p>
+    <w:p>
+      <w:r>
+        <w:t>合并结果的统计分量、系统分量和总不确定度分别为：</w:t>
+      </w:r>
+    </w:p>
+    <w:p>
+      <w:pPr>
+        <w:spacing w:before="60" w:after="100"/>
+        <w:jc w:val="center"/>
+      </w:pPr>
+      <w:r>
+        <w:rPr>
+          <w:rFonts w:ascii="Cambria Math" w:hAnsi="Cambria Math" w:eastAsia="Cambria Math"/>
+          <w:i/>
+          <w:color w:val="20313F"/>
+          <w:sz w:val="21"/>
+        </w:rPr>
+        <w:t>u_A = sqrt(7.3^2 + 1.5^2 + 0.4^2) = 7.46</w:t>
+      </w:r>
+    </w:p>
+    <w:p>
+      <w:r>
+        <w:t>表中的 7.3、1.5、0.4 已经舍入，因此显示值复算得到 7.46；论文使用未舍入的内部数值合成后报告为 7.4。这是显示精度差异，不是合成规则不同。</w:t>
+      </w:r>
+    </w:p>
+    <w:p>
+      <w:pPr>
+        <w:spacing w:before="60" w:after="100"/>
+        <w:jc w:val="center"/>
+      </w:pPr>
+      <w:r>
+        <w:rPr>
+          <w:rFonts w:ascii="Cambria Math" w:hAnsi="Cambria Math" w:eastAsia="Cambria Math"/>
+          <w:i/>
+          <w:color w:val="20313F"/>
+          <w:sz w:val="21"/>
+        </w:rPr>
+        <w:t>u_B = sqrt(2.0^2 + 5.0^2 + 0.1^2 + 0.4^2 + 0.9^2) = 5.5</w:t>
+      </w:r>
+    </w:p>
+    <w:p>
+      <w:pPr>
+        <w:spacing w:before="60" w:after="100"/>
+        <w:jc w:val="center"/>
+      </w:pPr>
+      <w:r>
+        <w:rPr>
+          <w:rFonts w:ascii="Cambria Math" w:hAnsi="Cambria Math" w:eastAsia="Cambria Math"/>
+          <w:i/>
+          <w:color w:val="20313F"/>
+          <w:sz w:val="21"/>
+        </w:rPr>
+        <w:t>u_Lu/SI = sqrt(7.4^2 + 5.5^2) = 9.2</w:t>
+      </w:r>
+    </w:p>
+    <w:p>
+      <w:pPr>
+        <w:pStyle w:val="Heading2"/>
+      </w:pPr>
+      <w:r>
+        <w:t>7.2 预算主导项</w:t>
+      </w:r>
+    </w:p>
+    <w:p>
+      <w:pPr>
+        <w:pStyle w:val="ListBullet"/>
+        <w:spacing w:after="60"/>
+        <w:ind w:left="331" w:hanging="230"/>
+      </w:pPr>
+      <w:r>
+        <w:t>统计侧主要由 Lu/TAI = 7.3 决定；它明显高于 TAI interpolation = 1.5 和 TAI/SI = 0.4。</w:t>
+      </w:r>
+    </w:p>
+    <w:p>
+      <w:pPr>
+        <w:pStyle w:val="ListBullet"/>
+        <w:spacing w:after="60"/>
+        <w:ind w:left="331" w:hanging="230"/>
+      </w:pPr>
+      <w:r>
+        <w:t>系统侧主要由 HM diurnal = 5.0 决定，反映光钟运行时段偏向白天时潜在的氢钟昼夜频率偏差。</w:t>
+      </w:r>
+    </w:p>
+    <w:p>
+      <w:pPr>
+        <w:pStyle w:val="ListBullet"/>
+        <w:spacing w:after="60"/>
+        <w:ind w:left="331" w:hanging="230"/>
+      </w:pPr>
+      <w:r>
+        <w:t>Cir. T 401 的 Lu/TAI = 19、TAI interpolation = 6.3，总不确定度达到 20，因此最终权重最低。</w:t>
+      </w:r>
+    </w:p>
+    <w:p>
+      <w:pPr>
+        <w:pStyle w:val="ListBullet"/>
+        <w:spacing w:after="60"/>
+        <w:ind w:left="331" w:hanging="230"/>
+      </w:pPr>
+      <w:r>
+        <w:t>Lu systematics = 0.1、引力红移 = 0.4，说明当前瓶颈主要在 HM 和远程时间链路，而不是 Lu+ 跃迁本体。</w:t>
+      </w:r>
+    </w:p>
+    <w:p>
+      <w:pPr>
+        <w:pStyle w:val="Heading2"/>
+      </w:pPr>
+      <w:r>
+        <w:t>7.3 相关性与改进方向</w:t>
+      </w:r>
+    </w:p>
+    <w:p>
+      <w:r>
+        <w:t>HM drift、HM diurnal、Lu 系统频移、引力红移以及大部分 PSFS 系统分量在三个月中共享设备、模型或校准来源，因此不能按三个独立样本平均。统计项可随独立数据增加而下降，但合并后的系统合计仍为 5.5，而不是 5.5/sqrt(3)。</w:t>
+      </w:r>
+    </w:p>
+    <w:tbl>
+      <w:tblPr>
+        <w:tblW w:type="auto" w:w="0"/>
+        <w:tblLayout w:type="fixed"/>
+        <w:tblLook w:firstColumn="1" w:firstRow="1" w:lastColumn="0" w:lastRow="0" w:noHBand="0" w:noVBand="1" w:val="04A0"/>
+      </w:tblPr>
+      <w:tblGrid>
+        <w:gridCol w:w="9878"/>
+      </w:tblGrid>
+      <w:tr>
+        <w:tc>
+          <w:tcPr>
+            <w:tcW w:type="dxa" w:w="9878"/>
+            <w:shd w:fill="EAF1F4"/>
+            <w:tcMar>
+              <w:top w:w="150" w:type="dxa"/>
+              <w:start w:w="190" w:type="dxa"/>
+              <w:bottom w:w="150" w:type="dxa"/>
+              <w:end w:w="190" w:type="dxa"/>
+            </w:tcMar>
+          </w:tcPr>
+          <w:p>
+            <w:pPr>
+              <w:spacing w:after="0"/>
+            </w:pPr>
+            <w:r>
+              <w:rPr>
+                <w:rFonts w:ascii="Microsoft YaHei" w:hAnsi="Microsoft YaHei" w:eastAsia="Microsoft YaHei"/>
+                <w:b/>
+                <w:color w:val="1F5D78"/>
+                <w:sz w:val="20"/>
+              </w:rPr>
+              <w:t xml:space="preserve">改进优先级  </w:t>
+            </w:r>
+            <w:r>
+              <w:rPr>
+                <w:rFonts w:ascii="Microsoft YaHei" w:hAnsi="Microsoft YaHei" w:eastAsia="Microsoft YaHei"/>
+                <w:color w:val="20313F"/>
+                <w:sz w:val="20"/>
+              </w:rPr>
+              <w:t>优先提高光钟 uptime、改善 HM 昼夜效应评估和远程频率传递；单独继续降低已经很小的 Lu+ 本体系统不确定度，对最终 9.2 x 10^-16 的改善有限。</w:t>
+            </w:r>
+          </w:p>
+        </w:tc>
+      </w:tr>
+    </w:tbl>
+    <w:p>
+      <w:pPr>
+        <w:spacing w:after="0"/>
+      </w:pPr>
+    </w:p>
+    <w:p>
+      <w:r>
+        <w:br w:type="page"/>
+      </w:r>
+    </w:p>
+    <w:p>
+      <w:pPr>
+        <w:pStyle w:val="Heading1"/>
+      </w:pPr>
+      <w:r>
+        <w:t>八、三个月结果与最终绝对频率</w:t>
       </w:r>
     </w:p>
     <w:p>
@@ -1354,7 +3444,7 @@
         <w:drawing>
           <wp:inline xmlns:a="http://schemas.openxmlformats.org/drawingml/2006/main" xmlns:pic="http://schemas.openxmlformats.org/drawingml/2006/picture">
             <wp:extent cx="4800600" cy="3840480"/>
-            <wp:docPr id="6" name="Picture 6" title="图 6 Circular T 399-401 月度 Lu/SI 结果与最终加权均值" descr="原论文 Figure 6：Circular T 399-401 月度 Lu/SI 结果与最终加权均值。三个独立月度结果在不确定度范围内一致。最终得到 f_Lu = 353 638 794 073 800.35(33) Hz，相对不确定度为 9.2 x 10^-16。"/>
+            <wp:docPr id="6" name="Picture 6" title="图 6 Circular T 399-401 月度 Lu/SI 结果与最终加权均值" descr="原论文 Figure 6：Circular T 399-401 月度 Lu/SI 结果与最终加权均值。三个月度估计在不确定度范围内一致。最终得到 f_Lu = 353 638 794 073 800.35(33) Hz，相对不确定度为 9.2 x 10^-16。"/>
             <wp:cNvGraphicFramePr>
               <a:graphicFrameLocks noChangeAspect="1"/>
             </wp:cNvGraphicFramePr>
@@ -1456,7 +3546,7 @@
                 <w:color w:val="20313F"/>
                 <w:sz w:val="20"/>
               </w:rPr>
-              <w:t>三个独立月度结果在不确定度范围内一致。最终得到 f_Lu = 353 638 794 073 800.35(33) Hz，相对不确定度为 9.2 x 10^-16。</w:t>
+              <w:t>三个月度估计在不确定度范围内一致。最终得到 f_Lu = 353 638 794 073 800.35(33) Hz，相对不确定度为 9.2 x 10^-16。</w:t>
             </w:r>
           </w:p>
         </w:tc>
@@ -1472,7 +3562,7 @@
         <w:pStyle w:val="Heading1"/>
       </w:pPr>
       <w:r>
-        <w:t>八、总结与评价</w:t>
+        <w:t>九、总结与评价</w:t>
       </w:r>
     </w:p>
     <w:p>

</xml_diff>